<commit_message>
Site updated: 2026-06-06 11:34:36
</commit_message>
<xml_diff>
--- a/files/Resume.docx
+++ b/files/Resume.docx
@@ -1007,6 +1007,8 @@
         </w:rPr>
         <w:t>Publication</w:t>
       </w:r>
+      <w:bookmarkStart w:id="22" w:name="_GoBack"/>
+      <w:bookmarkEnd w:id="22"/>
     </w:p>
     <w:tbl>
       <w:tblPr>
@@ -1043,6 +1045,12 @@
             <w:insideH w:val="none" w:color="000000" w:sz="0" w:space="0"/>
             <w:insideV w:val="none" w:color="000000" w:sz="0" w:space="0"/>
           </w:tblBorders>
+          <w:tblCellMar>
+            <w:top w:w="0" w:type="dxa"/>
+            <w:left w:w="108" w:type="dxa"/>
+            <w:bottom w:w="0" w:type="dxa"/>
+            <w:right w:w="108" w:type="dxa"/>
+          </w:tblCellMar>
         </w:tblPrEx>
         <w:trPr>
           <w:trHeight w:val="565" w:hRule="atLeast"/>
@@ -3698,7 +3706,7 @@
         <w:tc>
           <w:tcPr>
             <w:tcW w:w="2420" w:type="dxa"/>
-            <w:shd w:val="clear"/>
+            <w:shd w:val="clear" w:color="auto" w:fill="auto"/>
             <w:vAlign w:val="top"/>
           </w:tcPr>
           <w:p>
@@ -3740,7 +3748,7 @@
         <w:tc>
           <w:tcPr>
             <w:tcW w:w="8102" w:type="dxa"/>
-            <w:shd w:val="clear"/>
+            <w:shd w:val="clear" w:color="auto" w:fill="auto"/>
             <w:vAlign w:val="top"/>
           </w:tcPr>
           <w:p>
@@ -7427,8 +7435,6 @@
               </w:rPr>
               <w:t>2026.06.22</w:t>
             </w:r>
-            <w:bookmarkStart w:id="22" w:name="_GoBack"/>
-            <w:bookmarkEnd w:id="22"/>
           </w:p>
         </w:tc>
         <w:tc>
@@ -7779,13 +7785,13 @@
           <w:rtl w:val="0"/>
         </w:rPr>
       </w:pPr>
-      <w:bookmarkStart w:id="16" w:name="_svre57ckxq64" w:colFirst="0" w:colLast="0"/>
+      <w:bookmarkStart w:id="16" w:name="_1idfnmebayxq" w:colFirst="0" w:colLast="0"/>
       <w:bookmarkEnd w:id="16"/>
       <w:bookmarkStart w:id="17" w:name="_aicr5siofxnq" w:colFirst="0" w:colLast="0"/>
       <w:bookmarkEnd w:id="17"/>
       <w:bookmarkStart w:id="18" w:name="_zavfge3m3a2n" w:colFirst="0" w:colLast="0"/>
       <w:bookmarkEnd w:id="18"/>
-      <w:bookmarkStart w:id="19" w:name="_1idfnmebayxq" w:colFirst="0" w:colLast="0"/>
+      <w:bookmarkStart w:id="19" w:name="_svre57ckxq64" w:colFirst="0" w:colLast="0"/>
       <w:bookmarkEnd w:id="19"/>
     </w:p>
     <w:p>
@@ -10473,7 +10479,7 @@
         <w:rtl w:val="0"/>
         <w:lang w:val="en-US" w:eastAsia="zh-CN"/>
       </w:rPr>
-      <w:t>5</w:t>
+      <w:t>6</w:t>
     </w:r>
   </w:p>
 </w:ftr>

</xml_diff>

<commit_message>
Site updated: 2026-06-28 20:03:15
</commit_message>
<xml_diff>
--- a/files/Resume.docx
+++ b/files/Resume.docx
@@ -165,12 +165,6 @@
             <w:insideH w:val="none" w:color="000000" w:sz="0" w:space="0"/>
             <w:insideV w:val="none" w:color="000000" w:sz="0" w:space="0"/>
           </w:tblBorders>
-          <w:tblCellMar>
-            <w:top w:w="0" w:type="dxa"/>
-            <w:left w:w="108" w:type="dxa"/>
-            <w:bottom w:w="0" w:type="dxa"/>
-            <w:right w:w="108" w:type="dxa"/>
-          </w:tblCellMar>
         </w:tblPrEx>
         <w:trPr>
           <w:trHeight w:val="1380" w:hRule="atLeast"/>
@@ -1007,8 +1001,6 @@
         </w:rPr>
         <w:t>Publication</w:t>
       </w:r>
-      <w:bookmarkStart w:id="22" w:name="_GoBack"/>
-      <w:bookmarkEnd w:id="22"/>
     </w:p>
     <w:tbl>
       <w:tblPr>
@@ -5043,9 +5035,9 @@
           <w:lang w:val="en-US" w:eastAsia="zh-CN"/>
         </w:rPr>
       </w:pPr>
-      <w:bookmarkStart w:id="9" w:name="_k282yxnb7hz" w:colFirst="0" w:colLast="0"/>
+      <w:bookmarkStart w:id="9" w:name="_aemoe2sb37m5" w:colFirst="0" w:colLast="0"/>
       <w:bookmarkEnd w:id="9"/>
-      <w:bookmarkStart w:id="10" w:name="_aemoe2sb37m5" w:colFirst="0" w:colLast="0"/>
+      <w:bookmarkStart w:id="10" w:name="_k282yxnb7hz" w:colFirst="0" w:colLast="0"/>
       <w:bookmarkEnd w:id="10"/>
     </w:p>
     <w:p>
@@ -7785,11 +7777,11 @@
           <w:rtl w:val="0"/>
         </w:rPr>
       </w:pPr>
-      <w:bookmarkStart w:id="16" w:name="_1idfnmebayxq" w:colFirst="0" w:colLast="0"/>
+      <w:bookmarkStart w:id="16" w:name="_zavfge3m3a2n" w:colFirst="0" w:colLast="0"/>
       <w:bookmarkEnd w:id="16"/>
-      <w:bookmarkStart w:id="17" w:name="_aicr5siofxnq" w:colFirst="0" w:colLast="0"/>
+      <w:bookmarkStart w:id="17" w:name="_1idfnmebayxq" w:colFirst="0" w:colLast="0"/>
       <w:bookmarkEnd w:id="17"/>
-      <w:bookmarkStart w:id="18" w:name="_zavfge3m3a2n" w:colFirst="0" w:colLast="0"/>
+      <w:bookmarkStart w:id="18" w:name="_aicr5siofxnq" w:colFirst="0" w:colLast="0"/>
       <w:bookmarkEnd w:id="18"/>
       <w:bookmarkStart w:id="19" w:name="_svre57ckxq64" w:colFirst="0" w:colLast="0"/>
       <w:bookmarkEnd w:id="19"/>
@@ -7956,13 +7948,50 @@
             </w:pPr>
             <w:r>
               <w:rPr>
-                <w:rFonts w:hint="default" w:ascii="Times New Roman" w:hAnsi="Times New Roman" w:eastAsia="宋体" w:cs="Times New Roman"/>
+                <w:rFonts w:hint="eastAsia" w:ascii="Times New Roman" w:hAnsi="Times New Roman" w:eastAsia="宋体" w:cs="Times New Roman"/>
                 <w:sz w:val="24"/>
                 <w:szCs w:val="24"/>
                 <w:vertAlign w:val="baseline"/>
                 <w:rtl w:val="0"/>
                 <w:lang w:val="en-US" w:eastAsia="zh-CN"/>
               </w:rPr>
+              <w:t>Applied Linguistics (SSCI Q1)</w:t>
+            </w:r>
+          </w:p>
+          <w:p>
+            <w:pPr>
+              <w:pageBreakBefore w:val="0"/>
+              <w:widowControl/>
+              <w:kinsoku/>
+              <w:wordWrap/>
+              <w:overflowPunct/>
+              <w:topLinePunct w:val="0"/>
+              <w:autoSpaceDE/>
+              <w:autoSpaceDN/>
+              <w:bidi w:val="0"/>
+              <w:adjustRightInd/>
+              <w:snapToGrid/>
+              <w:spacing w:line="360" w:lineRule="auto"/>
+              <w:jc w:val="center"/>
+              <w:textAlignment w:val="auto"/>
+              <w:rPr>
+                <w:rFonts w:hint="default" w:ascii="Times New Roman" w:hAnsi="Times New Roman" w:eastAsia="宋体" w:cs="Times New Roman"/>
+                <w:sz w:val="24"/>
+                <w:szCs w:val="24"/>
+                <w:vertAlign w:val="baseline"/>
+                <w:rtl w:val="0"/>
+                <w:lang w:val="en-US" w:eastAsia="zh-CN"/>
+              </w:rPr>
+            </w:pPr>
+            <w:r>
+              <w:rPr>
+                <w:rFonts w:hint="default" w:ascii="Times New Roman" w:hAnsi="Times New Roman" w:eastAsia="宋体" w:cs="Times New Roman"/>
+                <w:sz w:val="24"/>
+                <w:szCs w:val="24"/>
+                <w:vertAlign w:val="baseline"/>
+                <w:rtl w:val="0"/>
+                <w:lang w:val="en-US" w:eastAsia="zh-CN"/>
+              </w:rPr>
               <w:t>Humanities &amp; Social Sciences Communications</w:t>
             </w:r>
             <w:r>
@@ -7974,7 +8003,7 @@
                 <w:rtl w:val="0"/>
                 <w:lang w:val="en-US" w:eastAsia="zh-CN"/>
               </w:rPr>
-              <w:t xml:space="preserve"> (SSCI &amp; AHCI)</w:t>
+              <w:t xml:space="preserve"> (SSCI Q1 &amp; AHCI)</w:t>
             </w:r>
           </w:p>
           <w:p>
@@ -8280,6 +8309,8 @@
               </w:rPr>
               <w:t>Why is Chinese the most difficult natural language to be acquired? Why is French so accurate?</w:t>
             </w:r>
+            <w:bookmarkStart w:id="22" w:name="_GoBack"/>
+            <w:bookmarkEnd w:id="22"/>
           </w:p>
           <w:p>
             <w:pPr>
@@ -8313,7 +8344,7 @@
                 <w:rtl w:val="0"/>
                 <w:lang w:val="en-US" w:eastAsia="zh-CN"/>
               </w:rPr>
-              <w:t>linguistics VS psychology: how they study psycholinguistics in their own way</w:t>
+              <w:t>Linguistics VS psychology: how they study psycholinguistics in their own way</w:t>
             </w:r>
           </w:p>
         </w:tc>

</xml_diff>